<commit_message>
Cambio de fecha en CV en universidad bancaria
</commit_message>
<xml_diff>
--- a/public/assets/CV/CV Uziel Sanchez Marin WORD.docx
+++ b/public/assets/CV/CV Uziel Sanchez Marin WORD.docx
@@ -195,7 +195,7 @@
               </wp:anchor>
             </w:drawing>
           </mc:Choice>
-          <mc:Fallback xmlns:oel="http://schemas.microsoft.com/office/2019/extlst" xmlns:w16du="http://schemas.microsoft.com/office/word/2023/wordml/word16du" xmlns:w16sdtfl="http://schemas.microsoft.com/office/word/2024/wordml/sdtformatlock">
+          <mc:Fallback xmlns:w16sdtfl="http://schemas.microsoft.com/office/word/2024/wordml/sdtformatlock" xmlns:w16du="http://schemas.microsoft.com/office/word/2023/wordml/word16du" xmlns:oel="http://schemas.microsoft.com/office/2019/extlst">
             <w:pict>
               <v:rect w14:anchorId="7D66648E" id="Rectángulo 6" o:spid="_x0000_s1026" style="position:absolute;margin-left:-2.5pt;margin-top:10.6pt;width:615pt;height:61.8pt;z-index:251659776;visibility:visible;mso-wrap-style:square;mso-width-percent:0;mso-height-percent:0;mso-wrap-distance-left:9pt;mso-wrap-distance-top:0;mso-wrap-distance-right:9pt;mso-wrap-distance-bottom:0;mso-position-horizontal:absolute;mso-position-horizontal-relative:page;mso-position-vertical:absolute;mso-position-vertical-relative:text;mso-width-percent:0;mso-height-percent:0;mso-width-relative:margin;mso-height-relative:margin;v-text-anchor:middle" o:gfxdata="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" fillcolor="#12232d" stroked="f" strokeweight="2pt">
                 <w10:wrap anchorx="page"/>
@@ -1531,7 +1531,7 @@
               </wp:inline>
             </w:drawing>
           </mc:Choice>
-          <mc:Fallback xmlns:oel="http://schemas.microsoft.com/office/2019/extlst" xmlns:w16du="http://schemas.microsoft.com/office/word/2023/wordml/word16du" xmlns:w16sdtfl="http://schemas.microsoft.com/office/word/2024/wordml/sdtformatlock">
+          <mc:Fallback xmlns:w16sdtfl="http://schemas.microsoft.com/office/word/2024/wordml/sdtformatlock" xmlns:w16du="http://schemas.microsoft.com/office/word/2023/wordml/word16du" xmlns:oel="http://schemas.microsoft.com/office/2019/extlst">
             <w:pict>
               <v:group w14:anchorId="3274067F" id="Group 103" o:spid="_x0000_s1026" style="width:170.1pt;height:2pt;mso-position-horizontal-relative:char;mso-position-vertical-relative:line" coordsize="3402,40" o:gfxdata="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">
                 <v:group id="Group 104" o:spid="_x0000_s1027" style="position:absolute;left:20;top:20;width:3362;height:2" coordorigin="20,20" coordsize="3362,2" o:gfxdata="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">
@@ -8306,7 +8306,7 @@
               </wp:inline>
             </w:drawing>
           </mc:Choice>
-          <mc:Fallback xmlns:oel="http://schemas.microsoft.com/office/2019/extlst" xmlns:w16du="http://schemas.microsoft.com/office/word/2023/wordml/word16du" xmlns:w16sdtfl="http://schemas.microsoft.com/office/word/2024/wordml/sdtformatlock">
+          <mc:Fallback xmlns:w16sdtfl="http://schemas.microsoft.com/office/word/2024/wordml/sdtformatlock" xmlns:w16du="http://schemas.microsoft.com/office/word/2023/wordml/word16du" xmlns:oel="http://schemas.microsoft.com/office/2019/extlst">
             <w:pict>
               <v:group w14:anchorId="2BF2D6B8" id="Group 98" o:spid="_x0000_s1026" style="width:106.9pt;height:2pt;mso-position-horizontal-relative:char;mso-position-vertical-relative:line" coordsize="2138,40" o:gfxdata="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">
                 <v:group id="Group 99" o:spid="_x0000_s1027" style="position:absolute;left:20;top:20;width:2099;height:2" coordorigin="20,20" coordsize="2099,2" o:gfxdata="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">
@@ -13460,7 +13460,7 @@
               </wp:inline>
             </w:drawing>
           </mc:Choice>
-          <mc:Fallback xmlns:oel="http://schemas.microsoft.com/office/2019/extlst" xmlns:w16du="http://schemas.microsoft.com/office/word/2023/wordml/word16du" xmlns:w16sdtfl="http://schemas.microsoft.com/office/word/2024/wordml/sdtformatlock">
+          <mc:Fallback xmlns:w16sdtfl="http://schemas.microsoft.com/office/word/2024/wordml/sdtformatlock" xmlns:w16du="http://schemas.microsoft.com/office/word/2023/wordml/word16du" xmlns:oel="http://schemas.microsoft.com/office/2019/extlst">
             <w:pict>
               <v:group w14:anchorId="18B30020" id="Group 95" o:spid="_x0000_s1026" style="width:170.1pt;height:1.8pt;mso-position-horizontal-relative:char;mso-position-vertical-relative:line" coordsize="3402,36" o:gfxdata="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">
                 <v:group id="Group 96" o:spid="_x0000_s1027" style="position:absolute;left:18;top:18;width:3366;height:2" coordorigin="18,18" coordsize="3366,2" o:gfxdata="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">
@@ -13693,7 +13693,18 @@
           <w:sz w:val="17"/>
           <w:szCs w:val="17"/>
         </w:rPr>
-        <w:t>02-2025</w:t>
+        <w:t>02-202</w:t>
+      </w:r>
+      <w:r>
+        <w:rPr>
+          <w:rFonts w:ascii="Times New Roman" w:eastAsia="Times New Roman" w:hAnsi="Times New Roman"/>
+          <w:i/>
+          <w:color w:val="6BBCCF"/>
+          <w:w w:val="105"/>
+          <w:sz w:val="17"/>
+          <w:szCs w:val="17"/>
+        </w:rPr>
+        <w:t>3</w:t>
       </w:r>
       <w:r>
         <w:rPr>
@@ -14370,7 +14381,7 @@
               </wp:inline>
             </w:drawing>
           </mc:Choice>
-          <mc:Fallback xmlns:oel="http://schemas.microsoft.com/office/2019/extlst" xmlns:w16du="http://schemas.microsoft.com/office/word/2023/wordml/word16du" xmlns:w16sdtfl="http://schemas.microsoft.com/office/word/2024/wordml/sdtformatlock">
+          <mc:Fallback xmlns:w16sdtfl="http://schemas.microsoft.com/office/word/2024/wordml/sdtformatlock" xmlns:w16du="http://schemas.microsoft.com/office/word/2023/wordml/word16du" xmlns:oel="http://schemas.microsoft.com/office/2019/extlst">
             <w:pict>
               <v:group w14:anchorId="7BA9CBD6" id="Group 92" o:spid="_x0000_s1026" style="width:79.1pt;height:1.8pt;mso-position-horizontal-relative:char;mso-position-vertical-relative:line" coordsize="1582,36" o:gfxdata="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">
                 <v:group id="Group 93" o:spid="_x0000_s1027" style="position:absolute;left:18;top:18;width:1546;height:2" coordorigin="18,18" coordsize="1546,2" o:gfxdata="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">
@@ -16174,7 +16185,7 @@
               </wp:inline>
             </w:drawing>
           </mc:Choice>
-          <mc:Fallback xmlns:oel="http://schemas.microsoft.com/office/2019/extlst" xmlns:w16du="http://schemas.microsoft.com/office/word/2023/wordml/word16du" xmlns:w16sdtfl="http://schemas.microsoft.com/office/word/2024/wordml/sdtformatlock">
+          <mc:Fallback xmlns:w16sdtfl="http://schemas.microsoft.com/office/word/2024/wordml/sdtformatlock" xmlns:w16du="http://schemas.microsoft.com/office/word/2023/wordml/word16du" xmlns:oel="http://schemas.microsoft.com/office/2019/extlst">
             <w:pict>
               <v:group w14:anchorId="483C5504" id="Group 72" o:spid="_x0000_s1026" style="width:65.6pt;height:1.8pt;mso-position-horizontal-relative:char;mso-position-vertical-relative:line" coordsize="1312,36" o:gfxdata="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">
                 <v:group id="Group 73" o:spid="_x0000_s1027" style="position:absolute;left:18;top:18;width:1277;height:2" coordorigin="18,18" coordsize="1277,2" o:gfxdata="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">
@@ -25226,8 +25237,6 @@
       </w:pPr>
       <w:r>
         <w:tab/>
-      </w:r>
-      <w:r>
         <w:t xml:space="preserve"> </w:t>
       </w:r>
       <w:r>
@@ -26752,7 +26761,7 @@
               </wp:inline>
             </w:drawing>
           </mc:Choice>
-          <mc:Fallback xmlns:oel="http://schemas.microsoft.com/office/2019/extlst" xmlns:w16du="http://schemas.microsoft.com/office/word/2023/wordml/word16du" xmlns:w16sdtfl="http://schemas.microsoft.com/office/word/2024/wordml/sdtformatlock">
+          <mc:Fallback xmlns:w16sdtfl="http://schemas.microsoft.com/office/word/2024/wordml/sdtformatlock" xmlns:w16du="http://schemas.microsoft.com/office/word/2023/wordml/word16du" xmlns:oel="http://schemas.microsoft.com/office/2019/extlst">
             <w:pict>
               <v:group w14:anchorId="4C1BD467" id="Group 22" o:spid="_x0000_s1026" style="width:186pt;height:1.8pt;mso-position-horizontal-relative:char;mso-position-vertical-relative:line" coordsize="3720,36" o:gfxdata="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">
                 <v:group id="Group 23" o:spid="_x0000_s1027" style="position:absolute;left:18;top:18;width:3684;height:2" coordorigin="18,18" coordsize="3684,2" o:gfxdata="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">
@@ -26883,7 +26892,7 @@
               </wp:anchor>
             </w:drawing>
           </mc:Choice>
-          <mc:Fallback xmlns:oel="http://schemas.microsoft.com/office/2019/extlst" xmlns:w16du="http://schemas.microsoft.com/office/word/2023/wordml/word16du" xmlns:w16sdtfl="http://schemas.microsoft.com/office/word/2024/wordml/sdtformatlock">
+          <mc:Fallback xmlns:w16sdtfl="http://schemas.microsoft.com/office/word/2024/wordml/sdtformatlock" xmlns:w16du="http://schemas.microsoft.com/office/word/2023/wordml/word16du" xmlns:oel="http://schemas.microsoft.com/office/2019/extlst">
             <w:pict>
               <v:group w14:anchorId="229FC929" id="Group 20" o:spid="_x0000_s1026" style="position:absolute;margin-left:159.55pt;margin-top:26.15pt;width:.1pt;height:10.25pt;z-index:-251663872;mso-position-horizontal-relative:page" coordorigin="3191,523" coordsize="2,205" o:gfxdata="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">
                 <v:shape id="Freeform 21" o:spid="_x0000_s1027" style="position:absolute;left:3191;top:523;width:2;height:205;visibility:visible;mso-wrap-style:square;v-text-anchor:top" coordsize="2,205" o:gfxdata="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" path="m,l,205e" filled="f" strokecolor="#e2e1e1" strokeweight=".2405mm">
@@ -27005,7 +27014,7 @@
               </wp:anchor>
             </w:drawing>
           </mc:Choice>
-          <mc:Fallback xmlns:oel="http://schemas.microsoft.com/office/2019/extlst" xmlns:w16du="http://schemas.microsoft.com/office/word/2023/wordml/word16du" xmlns:w16sdtfl="http://schemas.microsoft.com/office/word/2024/wordml/sdtformatlock">
+          <mc:Fallback xmlns:w16sdtfl="http://schemas.microsoft.com/office/word/2024/wordml/sdtformatlock" xmlns:w16du="http://schemas.microsoft.com/office/word/2023/wordml/word16du" xmlns:oel="http://schemas.microsoft.com/office/2019/extlst">
             <w:pict>
               <v:group w14:anchorId="31112CAF" id="Group 18" o:spid="_x0000_s1026" style="position:absolute;margin-left:190.9pt;margin-top:26.15pt;width:.1pt;height:10.25pt;z-index:-251662848;mso-position-horizontal-relative:page" coordorigin="3818,523" coordsize="2,205" o:gfxdata="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">
                 <v:shape id="Freeform 19" o:spid="_x0000_s1027" style="position:absolute;left:3818;top:523;width:2;height:205;visibility:visible;mso-wrap-style:square;v-text-anchor:top" coordsize="2,205" o:gfxdata="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" path="m,l,205e" filled="f" strokecolor="#e2e1e1" strokeweight=".19708mm">
@@ -28198,7 +28207,7 @@
               </wp:anchor>
             </w:drawing>
           </mc:Choice>
-          <mc:Fallback xmlns:oel="http://schemas.microsoft.com/office/2019/extlst" xmlns:w16du="http://schemas.microsoft.com/office/word/2023/wordml/word16du" xmlns:w16sdtfl="http://schemas.microsoft.com/office/word/2024/wordml/sdtformatlock">
+          <mc:Fallback xmlns:w16sdtfl="http://schemas.microsoft.com/office/word/2024/wordml/sdtformatlock" xmlns:w16du="http://schemas.microsoft.com/office/word/2023/wordml/word16du" xmlns:oel="http://schemas.microsoft.com/office/2019/extlst">
             <w:pict>
               <v:group w14:anchorId="3CBB9A6A" id="Group 16" o:spid="_x0000_s1026" style="position:absolute;margin-left:255.15pt;margin-top:20.7pt;width:.1pt;height:10.25pt;z-index:-251661824;mso-position-horizontal-relative:page" coordorigin="5103,414" coordsize="2,205" o:gfxdata="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">
                 <v:shape id="Freeform 17" o:spid="_x0000_s1027" style="position:absolute;left:5103;top:414;width:2;height:205;visibility:visible;mso-wrap-style:square;v-text-anchor:top" coordsize="2,205" o:gfxdata="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" path="m,l,205e" filled="f" strokecolor="#e2e1e1" strokeweight=".24781mm">
@@ -28710,7 +28719,7 @@
               </wp:anchor>
             </w:drawing>
           </mc:Choice>
-          <mc:Fallback xmlns:oel="http://schemas.microsoft.com/office/2019/extlst" xmlns:w16du="http://schemas.microsoft.com/office/word/2023/wordml/word16du" xmlns:w16sdtfl="http://schemas.microsoft.com/office/word/2024/wordml/sdtformatlock">
+          <mc:Fallback xmlns:w16sdtfl="http://schemas.microsoft.com/office/word/2024/wordml/sdtformatlock" xmlns:w16du="http://schemas.microsoft.com/office/word/2023/wordml/word16du" xmlns:oel="http://schemas.microsoft.com/office/2019/extlst">
             <w:pict>
               <v:group w14:anchorId="461885C6" id="Group 14" o:spid="_x0000_s1026" style="position:absolute;margin-left:186.7pt;margin-top:9.3pt;width:.1pt;height:10.25pt;z-index:-251660800;mso-position-horizontal-relative:page" coordorigin="3734,186" coordsize="2,205" o:gfxdata="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">
                 <v:shape id="Freeform 15" o:spid="_x0000_s1027" style="position:absolute;left:3734;top:186;width:2;height:205;visibility:visible;mso-wrap-style:square;v-text-anchor:top" coordsize="2,205" o:gfxdata="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" path="m,l,205e" filled="f" strokecolor="#e2e1e1" strokeweight=".19708mm">
@@ -29672,7 +29681,7 @@
               </wp:anchor>
             </w:drawing>
           </mc:Choice>
-          <mc:Fallback xmlns:oel="http://schemas.microsoft.com/office/2019/extlst" xmlns:w16du="http://schemas.microsoft.com/office/word/2023/wordml/word16du" xmlns:w16sdtfl="http://schemas.microsoft.com/office/word/2024/wordml/sdtformatlock">
+          <mc:Fallback xmlns:w16sdtfl="http://schemas.microsoft.com/office/word/2024/wordml/sdtformatlock" xmlns:w16du="http://schemas.microsoft.com/office/word/2023/wordml/word16du" xmlns:oel="http://schemas.microsoft.com/office/2019/extlst">
             <w:pict>
               <v:group w14:anchorId="03FAAC02" id="Group 2" o:spid="_x0000_s1026" style="position:absolute;margin-left:78.25pt;margin-top:9.65pt;width:.1pt;height:10.25pt;z-index:-251640832;mso-position-horizontal-relative:page" coordorigin="1565,193" coordsize="2,205" o:gfxdata="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">
                 <v:shape id="Freeform 3" o:spid="_x0000_s1027" style="position:absolute;left:1565;top:193;width:2;height:205;visibility:visible;mso-wrap-style:square;v-text-anchor:top" coordsize="2,205" o:gfxdata="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" path="m,l,205e" filled="f" strokecolor="#e2e1e1" strokeweight=".19708mm">
@@ -30695,7 +30704,7 @@
               </wp:inline>
             </w:drawing>
           </mc:Choice>
-          <mc:Fallback xmlns:oel="http://schemas.microsoft.com/office/2019/extlst" xmlns:w16du="http://schemas.microsoft.com/office/word/2023/wordml/word16du" xmlns:w16sdtfl="http://schemas.microsoft.com/office/word/2024/wordml/sdtformatlock">
+          <mc:Fallback xmlns:w16sdtfl="http://schemas.microsoft.com/office/word/2024/wordml/sdtformatlock" xmlns:w16du="http://schemas.microsoft.com/office/word/2023/wordml/word16du" xmlns:oel="http://schemas.microsoft.com/office/2019/extlst">
             <w:pict>
               <v:group w14:anchorId="70F94E3C" id="Group 11" o:spid="_x0000_s1026" style="width:100.3pt;height:1.8pt;mso-position-horizontal-relative:char;mso-position-vertical-relative:line" coordsize="2006,36" o:gfxdata="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">
                 <v:group id="Group 12" o:spid="_x0000_s1027" style="position:absolute;left:18;top:18;width:1971;height:2" coordorigin="18,18" coordsize="1971,2" o:gfxdata="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">
@@ -31640,7 +31649,7 @@
               </wp:inline>
             </w:drawing>
           </mc:Choice>
-          <mc:Fallback xmlns:oel="http://schemas.microsoft.com/office/2019/extlst" xmlns:w16du="http://schemas.microsoft.com/office/word/2023/wordml/word16du" xmlns:w16sdtfl="http://schemas.microsoft.com/office/word/2024/wordml/sdtformatlock">
+          <mc:Fallback xmlns:w16sdtfl="http://schemas.microsoft.com/office/word/2024/wordml/sdtformatlock" xmlns:w16du="http://schemas.microsoft.com/office/word/2023/wordml/word16du" xmlns:oel="http://schemas.microsoft.com/office/2019/extlst">
             <w:pict>
               <v:group w14:anchorId="0107B822" id="Group 8" o:spid="_x0000_s1026" style="width:87.95pt;height:2pt;mso-position-horizontal-relative:char;mso-position-vertical-relative:line" coordsize="1759,40" o:gfxdata="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">
                 <v:group id="Group 9" o:spid="_x0000_s1027" style="position:absolute;left:20;top:20;width:1719;height:2" coordorigin="20,20" coordsize="1719,2" o:gfxdata="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">
@@ -32361,7 +32370,7 @@
               </wp:anchor>
             </w:drawing>
           </mc:Choice>
-          <mc:Fallback xmlns:oel="http://schemas.microsoft.com/office/2019/extlst" xmlns:w16du="http://schemas.microsoft.com/office/word/2023/wordml/word16du" xmlns:w16sdtfl="http://schemas.microsoft.com/office/word/2024/wordml/sdtformatlock">
+          <mc:Fallback xmlns:w16sdtfl="http://schemas.microsoft.com/office/word/2024/wordml/sdtformatlock" xmlns:w16du="http://schemas.microsoft.com/office/word/2023/wordml/word16du" xmlns:oel="http://schemas.microsoft.com/office/2019/extlst">
             <w:pict>
               <v:group w14:anchorId="2845289B" id="Group 6" o:spid="_x0000_s1026" style="position:absolute;margin-left:142.25pt;margin-top:20.7pt;width:.1pt;height:10.25pt;z-index:-251659776;mso-position-horizontal-relative:page" coordorigin="2845,414" coordsize="2,205" o:gfxdata="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">
                 <v:shape id="Freeform 7" o:spid="_x0000_s1027" style="position:absolute;left:2845;top:414;width:2;height:205;visibility:visible;mso-wrap-style:square;v-text-anchor:top" coordsize="2,205" o:gfxdata="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" path="m,l,205e" filled="f" strokecolor="#e2e1e1" strokeweight=".22911mm">
@@ -34226,6 +34235,7 @@
   <w:style w:type="character" w:default="1" w:styleId="Fuentedeprrafopredeter">
     <w:name w:val="Default Paragraph Font"/>
     <w:uiPriority w:val="1"/>
+    <w:semiHidden/>
     <w:unhideWhenUsed/>
   </w:style>
   <w:style w:type="table" w:default="1" w:styleId="Tablanormal">

</xml_diff>